<commit_message>
Add EFA for new scales and CB-SEM CFA robustness check
- Pilot raised to n>=100 with EFA (PAF, promax, parallel analysis) for the
  new DAC, DPR and RU scales; split-sample fallback documented
- Lavaan CFA of the full measurement model with fit indices and a
  one-factor comparison, framed alongside PLS confirmatory composite analysis
- Manuscript now 3,789 words incl. references

Co-Authored-By: Claude Opus 5.5 <noreply@anthropic.com>
Claude-Session: https://claude.ai/code/session_01SPArV4q8dwhv3Npz3wnuCt
</commit_message>
<xml_diff>
--- a/dpp-textile-jbl/02_manuscript.docx
+++ b/dpp-textile-jbl/02_manuscript.docx
@@ -817,7 +817,7 @@
         <w:pStyle w:val="FirstParagraph"/>
       </w:pPr>
       <w:r>
-        <w:t xml:space="preserve">All constructs use multi-item reflective scales on 7-point Likert scales (Online Appendix A). Buyer-transmitted pressure adapts institutional pressure items (Zhu &amp; Sarkis, 2007) to EU data demands. Multi-tier data sharing adapts information sharing (Fawcett et al., 2007) and multi-tier visibility measures (Kembro et al., 2017). Digital traceability capability adapts supply visibility items (Srinivasan &amp; Swink, 2018). Data-appropriation concern and DPP readiness are new scales. Their items were generated from the ESPR text, the European Parliamentary Research Service (2024) textile DPP study and Jensen et al.’s (2023) data clusters, refined in expert interviews, and checked with a card-sorting task. Circular supply chain capability adapts circular economy practice items from the textile literature (Jia et al., 2020). EU export performance combines perceived performance relative to competitors with a reported change in EU export share. Controls are firm size (log employees), tier (finished goods versus intermediate), vertical integration, number of sustainability certifications, EU share of exports and perceived regulatory uncertainty.</w:t>
+        <w:t xml:space="preserve">All constructs use multi-item reflective scales on 7-point Likert scales (Online Appendix A). Buyer-transmitted pressure adapts institutional pressure items (Zhu &amp; Sarkis, 2007) to EU data demands. Multi-tier data sharing adapts information sharing (Fawcett et al., 2007) and multi-tier visibility measures (Kembro et al., 2017). Digital traceability capability adapts supply visibility items (Srinivasan &amp; Swink, 2018). Data-appropriation concern and DPP readiness are new scales. Their items were generated from the ESPR text, the European Parliamentary Research Service (2024) textile DPP study and Jensen et al.’s (2023) data clusters, refined in expert interviews, checked with a card-sorting task, and tested with exploratory factor analysis (EFA) on an independent pilot sample of [n] firms (Online Appendix A). Circular supply chain capability adapts circular economy practice items from the textile literature (Jia et al., 2020). EU export performance combines perceived performance relative to competitors with a reported change in EU export share. Controls are firm size (log employees), tier (finished goods versus intermediate), vertical integration, number of sustainability certifications, EU share of exports and perceived regulatory uncertainty.</w:t>
       </w:r>
     </w:p>
     <w:bookmarkEnd w:id="31"/>
@@ -835,7 +835,7 @@
         <w:pStyle w:val="FirstParagraph"/>
       </w:pPr>
       <w:r>
-        <w:t xml:space="preserve">We use PLS-SEM because the model is prediction-oriented, includes interaction terms and new scales, and the sample is moderate (Hair et al., 2019). Measurement is evaluated with loadings, composite reliability, AVE and HTMT (Henseler et al., 2015). Common-method variance is additionally checked with full-collinearity VIFs (Kock, 2015) and a marker variable. Interactions (H2, H4) use the two-stage approach. Significance uses 10,000 bootstrap samples. H5a versus H5b is decided by the sign, size and confidence interval of the DPP readiness → circular capability path, with buyer pressure included as a direct predictor of circular capability and an equivalence test to distinguish a true null from a non-significant effect. Out-of-sample predictive power is assessed with PLSpredict (Shmueli et al., 2019). Online Appendix B reports the full analysis plan and robustness checks.</w:t>
+        <w:t xml:space="preserve">We use PLS-SEM because the model is prediction-oriented, includes interaction terms and new scales, and the sample is moderate (Hair et al., 2019). Following the two-step approach (Anderson &amp; Gerbing, 1988), we assess the measurement model before the structural model. In PLS-SEM this is done through confirmatory composite analysis (Hair et al., 2020): loadings, composite reliability, AVE and HTMT (Henseler et al., 2015). Because the method debate around PLS-SEM remains active (Rönkkö &amp; Evermann, 2013), we also estimate a covariance-based confirmatory factor analysis (CFA) of the full measurement model as a robustness check. Common-method variance is additionally checked with full-collinearity VIFs (Kock, 2015) and a marker variable. Interactions (H2, H4) use the two-stage approach. Significance uses 10,000 bootstrap samples. H5a versus H5b is decided by the sign, size and confidence interval of the DPP readiness → circular capability path, with buyer pressure included as a direct predictor of circular capability and an equivalence test to distinguish a true null from a non-significant effect. Out-of-sample predictive power is assessed with PLSpredict (Shmueli et al., 2019). Online Appendix B reports the full analysis plan and robustness checks.</w:t>
       </w:r>
     </w:p>
     <w:bookmarkEnd w:id="32"/>
@@ -863,7 +863,7 @@
         <w:pStyle w:val="FirstParagraph"/>
       </w:pPr>
       <w:r>
-        <w:t xml:space="preserve">All indicator loadings exceeded [0.708], composite reliabilities ranged from [ ] to [ ], and every AVE exceeded [0.50] (Table 1). HTMT ratios were all below [0.85], with bootstrap confidence intervals excluding 1, supporting discriminant validity. Full-collinearity VIFs ranged from [ ] to [ ], below the 3.3 threshold, and controlling for the marker variable changed no path by more than [ ]. Common-method variance is therefore unlikely to account for the results.</w:t>
+        <w:t xml:space="preserve">In the pilot EFA, the new scales produced [three] factors that matched their intended constructs (KMO = [ ]; loadings ≥ [0.50]; no cross-loading above [0.30]). In the main sample, all indicator loadings exceeded [0.708], composite reliabilities ranged from [ ] to [ ], and every AVE exceeded [0.50] (Table 1). The covariance-based CFA fit the data acceptably (χ²/df = [ ], CFI = [ ], TLI = [ ], RMSEA = [ ], SRMR = [ ]). HTMT ratios were all below [0.85], with bootstrap confidence intervals excluding 1, supporting discriminant validity. Full-collinearity VIFs ranged from [ ] to [ ], below the 3.3 threshold, and controlling for the marker variable changed no path by more than [ ]. Common-method variance is therefore unlikely to account for the results.</w:t>
       </w:r>
     </w:p>
     <w:p>
@@ -1939,6 +1939,27 @@
         <w:pStyle w:val="BodyText"/>
       </w:pPr>
       <w:r>
+        <w:t xml:space="preserve">Anderson, J. C., &amp; Gerbing, D. W. (1988). Structural equation modeling in practice: A review and recommended two-step approach.</w:t>
+      </w:r>
+      <w:r>
+        <w:t xml:space="preserve"> </w:t>
+      </w:r>
+      <w:r>
+        <w:rPr>
+          <w:iCs/>
+          <w:i/>
+        </w:rPr>
+        <w:t xml:space="preserve">Psychological Bulletin, 103</w:t>
+      </w:r>
+      <w:r>
+        <w:t xml:space="preserve">(3), 411–423.</w:t>
+      </w:r>
+    </w:p>
+    <w:p>
+      <w:pPr>
+        <w:pStyle w:val="BodyText"/>
+      </w:pPr>
+      <w:r>
         <w:t xml:space="preserve">Armstrong, J. S., &amp; Overton, T. S. (1977). Estimating nonresponse bias in mail surveys.</w:t>
       </w:r>
       <w:r>
@@ -2197,6 +2218,27 @@
         <w:pStyle w:val="BodyText"/>
       </w:pPr>
       <w:r>
+        <w:t xml:space="preserve">Hair, J. F., Howard, M. C., &amp; Nitzl, C. (2020). Assessing measurement model quality in PLS-SEM using confirmatory composite analysis.</w:t>
+      </w:r>
+      <w:r>
+        <w:t xml:space="preserve"> </w:t>
+      </w:r>
+      <w:r>
+        <w:rPr>
+          <w:iCs/>
+          <w:i/>
+        </w:rPr>
+        <w:t xml:space="preserve">Journal of Business Research, 109</w:t>
+      </w:r>
+      <w:r>
+        <w:t xml:space="preserve">, 101–110.</w:t>
+      </w:r>
+    </w:p>
+    <w:p>
+      <w:pPr>
+        <w:pStyle w:val="BodyText"/>
+      </w:pPr>
+      <w:r>
         <w:t xml:space="preserve">Henseler, J., Ringle, C. M., &amp; Sarstedt, M. (2015). A new criterion for assessing discriminant validity in variance-based structural equation modeling.</w:t>
       </w:r>
       <w:r>
@@ -2421,6 +2463,27 @@
       </w:r>
       <w:r>
         <w:t xml:space="preserve">(1), 257–294.</w:t>
+      </w:r>
+    </w:p>
+    <w:p>
+      <w:pPr>
+        <w:pStyle w:val="BodyText"/>
+      </w:pPr>
+      <w:r>
+        <w:t xml:space="preserve">Rönkkö, M., &amp; Evermann, J. (2013). A critical examination of common beliefs about partial least squares path modeling.</w:t>
+      </w:r>
+      <w:r>
+        <w:t xml:space="preserve"> </w:t>
+      </w:r>
+      <w:r>
+        <w:rPr>
+          <w:iCs/>
+          <w:i/>
+        </w:rPr>
+        <w:t xml:space="preserve">Organizational Research Methods, 16</w:t>
+      </w:r>
+      <w:r>
+        <w:t xml:space="preserve">(3), 425–448.</w:t>
       </w:r>
     </w:p>
     <w:p>

</xml_diff>

<commit_message>
Add simulated survey, Python fsQCA engine and illustrative results
- simulate_survey.py answers every item for 50 fictional firms in seven
  Indian-cluster archetypes; assumptions documented
- fsqca.py implements calibration, necessity, truth tables, QM
  minimisation, intermediate solutions with core conditions, robustness
- 02b illustrative manuscript (watermarked) with simulated results and an
  owned/negotiated/borrowed theory of supplier information capacity
- Template: formal vs informal circularity split; blank data template

Co-Authored-By: Claude Opus 5.5 <noreply@anthropic.com>
Claude-Session: https://claude.ai/code/session_01SPArV4q8dwhv3Npz3wnuCt
</commit_message>
<xml_diff>
--- a/dpp-textile-jbl/02_manuscript.docx
+++ b/dpp-textile-jbl/02_manuscript.docx
@@ -1555,7 +1555,23 @@
         <w:pStyle w:val="FirstParagraph"/>
       </w:pPr>
       <w:r>
-        <w:t xml:space="preserve">Using the QCA package in R (Dusa, 2019), we first tested each condition for necessity (consistency ≥ 0.90; Schneider &amp; Wagemann, 2012). We then built truth tables for high and low readiness, with a frequency threshold of one case, raw consistency ≥ 0.80 and PRI consistency ≥ 0.70 (Greckhamer et al., 2018; Ragin, 2008). We report intermediate solutions based on the directional expectations in P1–P3, distinguishing core from peripheral conditions (Fiss, 2011). For P4, we analysed circular capability with readiness included as a condition. With five conditions there are 32 logically possible configurations, and a sample of this size will not cover all of them (limited diversity). We therefore report how many truth-table rows contain cases, and we justify every simplifying assumption made for the intermediate solution against theory, avoiding untenable assumptions about configurations not observed in the sample (Schneider &amp; Wagemann, 2012). Robustness checks varied calibration anchors, the consistency threshold (0.75–0.85) and the frequency threshold, and replaced one condition with sustainability certifications (Online Appendix B).</w:t>
+        <w:t xml:space="preserve">Using the QCA package in R (Dusa, 2019), we first tested each condition for necessity (consistency ≥ 0.90; Schneider &amp; Wagemann, 2012). We then built truth tables for high and low readiness, with a frequency threshold of one case, raw consistency ≥ 0.80 and PRI consistency ≥ 0.70 (Greckhamer et al., 2018; Ragin, 2008). We report intermediate solutions based on the directional expectations in P1–P3, distinguishing core from peripheral conditions (Fiss, 2011). For P4, we analysed circular capability with readiness included as a condition, both for all circular practices and for</w:t>
+      </w:r>
+      <w:r>
+        <w:t xml:space="preserve"> </w:t>
+      </w:r>
+      <w:r>
+        <w:rPr>
+          <w:iCs/>
+          <w:i/>
+        </w:rPr>
+        <w:t xml:space="preserve">formal</w:t>
+      </w:r>
+      <w:r>
+        <w:t xml:space="preserve"> </w:t>
+      </w:r>
+      <w:r>
+        <w:t xml:space="preserve">practices only (recycled inputs, design-for-recycling, take-back), because informal practices such as selling cutting waste need no product data. With five conditions there are 32 logically possible configurations, and a sample of this size will not cover all of them (limited diversity). We therefore report how many truth-table rows contain cases, and we justify every simplifying assumption made for the intermediate solution against theory, avoiding untenable assumptions about configurations not observed in the sample (Schneider &amp; Wagemann, 2012). Robustness checks varied calibration anchors, the consistency threshold (0.75–0.85) and the frequency threshold, and replaced one condition with sustainability certifications (Online Appendix B).</w:t>
       </w:r>
     </w:p>
     <w:bookmarkEnd w:id="31"/>

</xml_diff>